<commit_message>
Korvane test corpus: 80 hand-authored files in 9 lanes (core + extended tiers) with 4,846-fact ground-truth manifests
</commit_message>
<xml_diff>
--- a/tests/corpus/korvane/files/finance/board_minutes_2024_06_28.docx
+++ b/tests/corpus/korvane/files/finance/board_minutes_2024_06_28.docx
@@ -427,6 +427,9 @@
         <w:gridCol w:w="2160"/>
       </w:tblGrid>
       <w:tr>
+        <w:trPr>
+          <w:cantSplit/>
+        </w:trPr>
         <w:tc>
           <w:tcPr>
             <w:tcW w:type="dxa" w:w="2160"/>
@@ -481,6 +484,9 @@
         </w:tc>
       </w:tr>
       <w:tr>
+        <w:trPr>
+          <w:cantSplit/>
+        </w:trPr>
         <w:tc>
           <w:tcPr>
             <w:tcW w:type="dxa" w:w="2160"/>
@@ -523,6 +529,9 @@
         </w:tc>
       </w:tr>
       <w:tr>
+        <w:trPr>
+          <w:cantSplit/>
+        </w:trPr>
         <w:tc>
           <w:tcPr>
             <w:tcW w:type="dxa" w:w="2160"/>
@@ -565,6 +574,9 @@
         </w:tc>
       </w:tr>
       <w:tr>
+        <w:trPr>
+          <w:cantSplit/>
+        </w:trPr>
         <w:tc>
           <w:tcPr>
             <w:tcW w:type="dxa" w:w="2160"/>
@@ -607,6 +619,9 @@
         </w:tc>
       </w:tr>
       <w:tr>
+        <w:trPr>
+          <w:cantSplit/>
+        </w:trPr>
         <w:tc>
           <w:tcPr>
             <w:tcW w:type="dxa" w:w="2160"/>
@@ -649,6 +664,9 @@
         </w:tc>
       </w:tr>
       <w:tr>
+        <w:trPr>
+          <w:cantSplit/>
+        </w:trPr>
         <w:tc>
           <w:tcPr>
             <w:tcW w:type="dxa" w:w="2160"/>

</xml_diff>